<commit_message>
feat: freeze v0.1.0 agent baseline
</commit_message>
<xml_diff>
--- a/deliverables/药物重定位Agent_课程设计报告草稿.docx
+++ b/deliverables/药物重定位Agent_课程设计报告草稿.docx
@@ -19,7 +19,7 @@
           <w:i/>
           <w:color w:val="5A646C"/>
         </w:rPr>
-        <w:t>状态：技术结果草稿。仓库和工作区未包含课程任务 PDF；篇幅、章节、封面及答辩格式须在取得 PDF 后核对。本报告不构成临床建议。</w:t>
+        <w:t>状态：技术结果草稿。课程任务 PDF 已核对：要求覆盖 Problem、Data、Model、Benchmark、Biological interpretation 五环节，提交 GitHub 代码并进行约 10 分钟汇报；PDF 未规定报告篇幅、封面或单独视频。本报告不构成临床建议。</w:t>
       </w:r>
     </w:p>
     <w:p>
@@ -61,7 +61,7 @@
     </w:p>
     <w:p>
       <w:r>
-        <w:t>原计划包含 Jev 决策模型、通用 LLM、外部基准、内部 Eval、LUAD 端到端案例和课程展示。本阶段已实现确定性分析主流程及可选 Jev 接口。没有 TypeSafe API 凭据，故无 Jev 实测准确率、延迟或成本结论；通用 LLM 对比、完整内部 Eval 和课程 PDF 指定交付格式仍待完成。</w:t>
+        <w:t>原计划包含 Jev 决策模型、通用 LLM、外部基准、内部 Eval、LUAD 端到端案例和课程展示。本阶段已实现确定性分析主流程、自然语言任务路由、受控工具调用、完整 Agent Trace 及可选 Jev 接口。默认 Planner 为可复现的规则降级，另提供结构化外部 LLM 适配边界；没有通用 LLM 或 TypeSafe API 凭据，故无真实 LLM/Jev 准确率、延迟或成本结论。</w:t>
       </w:r>
     </w:p>
     <w:p>
@@ -1928,18 +1928,42 @@
     </w:p>
     <w:p>
       <w:r>
-        <w:t>系统包含表达数据读取与 QC、差异表达、排序、RECeSS 适配器、药物身份核对、PubMed 线索检索、证据账本和 LUAD 案例打包器。案例打包器校验原始与中间文件哈希、排名连续性、分数有效性、Top-10 账本及预先冻结的参考药清单，再输出 JSON 报告、阶段轨迹和外部模型调用成本。目前默认路由到人工复核，外部模型调用次数为零。可选 Jev 适配器依照 TypeSafe 官方 API 支持 Choice、Score、Noul；回答须经过代码验证，低置信度、服务失败和临床发布请求不能自动放行。没有凭据时不调用 Jev，也不伪造 Jev 结果。</w:t>
+        <w:t xml:space="preserve">系统包含自然语言 Planner、允许列表工具 Schema、表达数据读取与 QC、差异表达、排序、RECeSS 适配器、药物身份核对、PubMed 线索检索、证据账本和 LUAD 案例打包器。Planner 只接收模式和可用输入名称，不接收原始矩阵、文件路径或 Benchmark 标签；外部 LLM 返回的调用还须经过工具名、参数和模式权限验证。缺少输入时系统进入 </w:t>
+      </w:r>
+      <w:r>
+        <w:t>needs_input</w:t>
+      </w:r>
+      <w:r>
+        <w:t xml:space="preserve">，越权调用进入 </w:t>
+      </w:r>
+      <w:r>
+        <w:t>blocked</w:t>
+      </w:r>
+      <w:r>
+        <w:t xml:space="preserve">，工具异常进入 </w:t>
+      </w:r>
+      <w:r>
+        <w:t>failed</w:t>
+      </w:r>
+      <w:r>
+        <w:t xml:space="preserve">，全部写入 </w:t>
+      </w:r>
+      <w:r>
+        <w:t>agent_run.json</w:t>
+      </w:r>
+      <w:r>
+        <w:t>。案例打包器校验原始与中间文件哈希、排名连续性、分数有效性、Top-10 账本及预先冻结的参考药清单，再输出 JSON 报告、阶段轨迹和外部模型调用成本。目前默认路由到人工复核，外部模型调用次数为零。可选 Jev 适配器依照 TypeSafe 官方 API 支持 Choice、Score、Noul；回答须经过代码验证，低置信度、服务失败和临床发布请求不能自动放行。没有凭据时不调用 Jev，也不伪造 Jev 结果。</w:t>
       </w:r>
     </w:p>
     <w:p>
       <w:r>
-        <w:t xml:space="preserve">Python 3.10 的测试依赖记录在 </w:t>
+        <w:t xml:space="preserve">Python 3.10 的 Benchmark 测试依赖记录在 </w:t>
       </w:r>
       <w:r>
         <w:t>requirements-benchmark.lock</w:t>
       </w:r>
       <w:r>
-        <w:t>。全新环境安装后，19 项内部测试通过。</w:t>
+        <w:t>。当前环境中 23 项内部测试通过，其中新增自然语言路由、缺输入停机、外部 Planner 工具白名单和 Strict 模式权限测试。</w:t>
       </w:r>
       <w:r>
         <w:t>data/manifests/</w:t>
@@ -1969,7 +1993,7 @@
     </w:p>
     <w:p>
       <w:r>
-        <w:t>下一阶段需完成化合物层面的再核对、开放靶点与通路证据、人工审阅文献、更多独立疾病与细胞系验证、完整的 RECeSS 调参方案和更大的内部 Eval。若获得 Jev 访问权限，再在冻结决策数据集上比较 Jev、规则与通用 LLM 的准确率、校准、延迟和成本。课程任务 PDF 到位后，还需据其具体要求调整报告、答辩 PPT 与演示视频。</w:t>
+        <w:t>下一阶段需完成化合物层面的再核对、开放靶点与通路证据、人工审阅文献、更多独立疾病与细胞系验证、完整的 RECeSS 调参方案和更大的内部 Eval。若获得通用 LLM 与 Jev 访问权限，再在冻结决策数据集上比较 Jev、规则与通用 LLM 的准确率、校准、延迟和成本。课程 PDF 已完成核对；后续仅需把最新 Agent Trace 纳入约 10 分钟答辩材料并重新做视觉检查。</w:t>
       </w:r>
     </w:p>
     <w:p>

</xml_diff>